<commit_message>
Date: 05 Mar 2026
</commit_message>
<xml_diff>
--- a/Assignments.docx
+++ b/Assignments.docx
@@ -836,17 +836,78 @@
     </w:p>
     <w:p>
       <w:pPr>
+        <w:rPr>
+          <w:sz w:val="26"/>
+          <w:szCs w:val="24"/>
+          <w:lang w:val="en-US"/>
+        </w:rPr>
+      </w:pPr>
+    </w:p>
+    <w:p>
+      <w:pPr>
+        <w:rPr>
+          <w:sz w:val="26"/>
+          <w:szCs w:val="24"/>
+          <w:lang w:val="en-US"/>
+        </w:rPr>
+      </w:pPr>
+    </w:p>
+    <w:p>
+      <w:pPr>
+        <w:rPr>
+          <w:sz w:val="26"/>
+          <w:szCs w:val="24"/>
+          <w:lang w:val="en-US"/>
+        </w:rPr>
+      </w:pPr>
+      <w:r>
+        <w:rPr>
+          <w:sz w:val="26"/>
+          <w:szCs w:val="24"/>
+          <w:lang w:val="en-US"/>
+        </w:rPr>
+        <w:br w:type="page"/>
+      </w:r>
+    </w:p>
+    <w:p>
+      <w:pPr>
+        <w:rPr>
+          <w:sz w:val="26"/>
+          <w:szCs w:val="24"/>
+          <w:lang w:val="en-US"/>
+        </w:rPr>
+      </w:pPr>
+      <w:r>
+        <w:rPr>
+          <w:sz w:val="26"/>
+          <w:szCs w:val="24"/>
+          <w:lang w:val="en-US"/>
+        </w:rPr>
+        <w:lastRenderedPageBreak/>
+        <w:t>Selenium Assignments</w:t>
+      </w:r>
+    </w:p>
+    <w:p>
+      <w:pPr>
         <w:pStyle w:val="ListParagraph"/>
         <w:numPr>
           <w:ilvl w:val="0"/>
-          <w:numId w:val="1"/>
-        </w:numPr>
-        <w:rPr>
-          <w:sz w:val="26"/>
-          <w:szCs w:val="24"/>
-          <w:lang w:val="en-US"/>
-        </w:rPr>
-      </w:pPr>
+          <w:numId w:val="2"/>
+        </w:numPr>
+        <w:rPr>
+          <w:sz w:val="26"/>
+          <w:szCs w:val="24"/>
+          <w:lang w:val="en-US"/>
+        </w:rPr>
+      </w:pPr>
+      <w:r>
+        <w:rPr>
+          <w:sz w:val="26"/>
+          <w:szCs w:val="24"/>
+          <w:lang w:val="en-US"/>
+        </w:rPr>
+        <w:t>What is the use and return type of getPageSource() method?</w:t>
+      </w:r>
       <w:bookmarkStart w:id="0" w:name="_GoBack"/>
       <w:bookmarkEnd w:id="0"/>
     </w:p>
@@ -951,8 +1012,100 @@
       </w:pPr>
     </w:lvl>
   </w:abstractNum>
+  <w:abstractNum w:abstractNumId="1">
+    <w:nsid w:val="4D35219C"/>
+    <w:multiLevelType w:val="hybridMultilevel"/>
+    <w:tmpl w:val="C2828002"/>
+    <w:lvl w:ilvl="0" w:tplc="4009000F">
+      <w:start w:val="1"/>
+      <w:numFmt w:val="decimal"/>
+      <w:lvlText w:val="%1."/>
+      <w:lvlJc w:val="left"/>
+      <w:pPr>
+        <w:ind w:left="720" w:hanging="360"/>
+      </w:pPr>
+      <w:rPr>
+        <w:rFonts w:hint="default"/>
+      </w:rPr>
+    </w:lvl>
+    <w:lvl w:ilvl="1" w:tplc="40090019" w:tentative="1">
+      <w:start w:val="1"/>
+      <w:numFmt w:val="lowerLetter"/>
+      <w:lvlText w:val="%2."/>
+      <w:lvlJc w:val="left"/>
+      <w:pPr>
+        <w:ind w:left="1440" w:hanging="360"/>
+      </w:pPr>
+    </w:lvl>
+    <w:lvl w:ilvl="2" w:tplc="4009001B" w:tentative="1">
+      <w:start w:val="1"/>
+      <w:numFmt w:val="lowerRoman"/>
+      <w:lvlText w:val="%3."/>
+      <w:lvlJc w:val="right"/>
+      <w:pPr>
+        <w:ind w:left="2160" w:hanging="180"/>
+      </w:pPr>
+    </w:lvl>
+    <w:lvl w:ilvl="3" w:tplc="4009000F" w:tentative="1">
+      <w:start w:val="1"/>
+      <w:numFmt w:val="decimal"/>
+      <w:lvlText w:val="%4."/>
+      <w:lvlJc w:val="left"/>
+      <w:pPr>
+        <w:ind w:left="2880" w:hanging="360"/>
+      </w:pPr>
+    </w:lvl>
+    <w:lvl w:ilvl="4" w:tplc="40090019" w:tentative="1">
+      <w:start w:val="1"/>
+      <w:numFmt w:val="lowerLetter"/>
+      <w:lvlText w:val="%5."/>
+      <w:lvlJc w:val="left"/>
+      <w:pPr>
+        <w:ind w:left="3600" w:hanging="360"/>
+      </w:pPr>
+    </w:lvl>
+    <w:lvl w:ilvl="5" w:tplc="4009001B" w:tentative="1">
+      <w:start w:val="1"/>
+      <w:numFmt w:val="lowerRoman"/>
+      <w:lvlText w:val="%6."/>
+      <w:lvlJc w:val="right"/>
+      <w:pPr>
+        <w:ind w:left="4320" w:hanging="180"/>
+      </w:pPr>
+    </w:lvl>
+    <w:lvl w:ilvl="6" w:tplc="4009000F" w:tentative="1">
+      <w:start w:val="1"/>
+      <w:numFmt w:val="decimal"/>
+      <w:lvlText w:val="%7."/>
+      <w:lvlJc w:val="left"/>
+      <w:pPr>
+        <w:ind w:left="5040" w:hanging="360"/>
+      </w:pPr>
+    </w:lvl>
+    <w:lvl w:ilvl="7" w:tplc="40090019" w:tentative="1">
+      <w:start w:val="1"/>
+      <w:numFmt w:val="lowerLetter"/>
+      <w:lvlText w:val="%8."/>
+      <w:lvlJc w:val="left"/>
+      <w:pPr>
+        <w:ind w:left="5760" w:hanging="360"/>
+      </w:pPr>
+    </w:lvl>
+    <w:lvl w:ilvl="8" w:tplc="4009001B" w:tentative="1">
+      <w:start w:val="1"/>
+      <w:numFmt w:val="lowerRoman"/>
+      <w:lvlText w:val="%9."/>
+      <w:lvlJc w:val="right"/>
+      <w:pPr>
+        <w:ind w:left="6480" w:hanging="180"/>
+      </w:pPr>
+    </w:lvl>
+  </w:abstractNum>
   <w:num w:numId="1">
     <w:abstractNumId w:val="0"/>
+  </w:num>
+  <w:num w:numId="2">
+    <w:abstractNumId w:val="1"/>
   </w:num>
 </w:numbering>
 </file>

</xml_diff>

<commit_message>
Date: 06 Mar 2026
</commit_message>
<xml_diff>
--- a/Assignments.docx
+++ b/Assignments.docx
@@ -908,8 +908,320 @@
         </w:rPr>
         <w:t>What is the use and return type of getPageSource() method?</w:t>
       </w:r>
+    </w:p>
+    <w:p>
+      <w:pPr>
+        <w:pStyle w:val="ListParagraph"/>
+        <w:numPr>
+          <w:ilvl w:val="0"/>
+          <w:numId w:val="2"/>
+        </w:numPr>
+        <w:rPr>
+          <w:sz w:val="26"/>
+          <w:szCs w:val="24"/>
+          <w:lang w:val="en-US"/>
+        </w:rPr>
+      </w:pPr>
+      <w:r>
+        <w:rPr>
+          <w:sz w:val="26"/>
+          <w:szCs w:val="24"/>
+          <w:lang w:val="en-US"/>
+        </w:rPr>
+        <w:t xml:space="preserve">Launch </w:t>
+      </w:r>
+      <w:hyperlink r:id="rId5" w:history="1">
+        <w:r>
+          <w:rPr>
+            <w:rStyle w:val="Hyperlink"/>
+            <w:sz w:val="26"/>
+            <w:szCs w:val="24"/>
+            <w:lang w:val="en-US"/>
+          </w:rPr>
+          <w:t>https://www.echotrak.com/Login.aspx?ReturnUrl=%2f</w:t>
+        </w:r>
+      </w:hyperlink>
+    </w:p>
+    <w:p>
+      <w:pPr>
+        <w:pStyle w:val="ListParagraph"/>
+        <w:numPr>
+          <w:ilvl w:val="1"/>
+          <w:numId w:val="2"/>
+        </w:numPr>
+        <w:rPr>
+          <w:sz w:val="26"/>
+          <w:szCs w:val="24"/>
+          <w:lang w:val="en-US"/>
+        </w:rPr>
+      </w:pPr>
+      <w:r>
+        <w:rPr>
+          <w:sz w:val="26"/>
+          <w:szCs w:val="24"/>
+          <w:lang w:val="en-US"/>
+        </w:rPr>
+        <w:t>Enter user name</w:t>
+      </w:r>
+    </w:p>
+    <w:p>
+      <w:pPr>
+        <w:pStyle w:val="ListParagraph"/>
+        <w:numPr>
+          <w:ilvl w:val="1"/>
+          <w:numId w:val="2"/>
+        </w:numPr>
+        <w:rPr>
+          <w:sz w:val="26"/>
+          <w:szCs w:val="24"/>
+          <w:lang w:val="en-US"/>
+        </w:rPr>
+      </w:pPr>
+      <w:r>
+        <w:rPr>
+          <w:sz w:val="26"/>
+          <w:szCs w:val="24"/>
+          <w:lang w:val="en-US"/>
+        </w:rPr>
+        <w:t>Enter password</w:t>
+      </w:r>
+    </w:p>
+    <w:p>
+      <w:pPr>
+        <w:pStyle w:val="ListParagraph"/>
+        <w:numPr>
+          <w:ilvl w:val="1"/>
+          <w:numId w:val="2"/>
+        </w:numPr>
+        <w:rPr>
+          <w:sz w:val="26"/>
+          <w:szCs w:val="24"/>
+          <w:lang w:val="en-US"/>
+        </w:rPr>
+      </w:pPr>
+      <w:r>
+        <w:rPr>
+          <w:sz w:val="26"/>
+          <w:szCs w:val="24"/>
+          <w:lang w:val="en-US"/>
+        </w:rPr>
+        <w:t>Click on Login button</w:t>
+      </w:r>
+    </w:p>
+    <w:p>
+      <w:pPr>
+        <w:pStyle w:val="ListParagraph"/>
+        <w:numPr>
+          <w:ilvl w:val="1"/>
+          <w:numId w:val="2"/>
+        </w:numPr>
+        <w:rPr>
+          <w:sz w:val="26"/>
+          <w:szCs w:val="24"/>
+          <w:lang w:val="en-US"/>
+        </w:rPr>
+      </w:pPr>
+      <w:r>
+        <w:rPr>
+          <w:sz w:val="26"/>
+          <w:szCs w:val="24"/>
+          <w:lang w:val="en-US"/>
+        </w:rPr>
+        <w:t>Display the error message</w:t>
+      </w:r>
+      <w:r>
+        <w:rPr>
+          <w:sz w:val="26"/>
+          <w:szCs w:val="24"/>
+          <w:lang w:val="en-US"/>
+        </w:rPr>
+        <w:br/>
+      </w:r>
+      <w:r>
+        <w:rPr>
+          <w:b/>
+          <w:bCs/>
+          <w:sz w:val="26"/>
+          <w:szCs w:val="24"/>
+          <w:lang w:val="en-US"/>
+        </w:rPr>
+        <w:t>Use ID Locator</w:t>
+      </w:r>
+    </w:p>
+    <w:p>
+      <w:pPr>
+        <w:pStyle w:val="ListParagraph"/>
+        <w:numPr>
+          <w:ilvl w:val="0"/>
+          <w:numId w:val="2"/>
+        </w:numPr>
+        <w:rPr>
+          <w:sz w:val="26"/>
+          <w:szCs w:val="24"/>
+          <w:lang w:val="en-US"/>
+        </w:rPr>
+      </w:pPr>
+      <w:r>
+        <w:rPr>
+          <w:sz w:val="26"/>
+          <w:szCs w:val="24"/>
+          <w:lang w:val="en-US"/>
+        </w:rPr>
+        <w:t xml:space="preserve">Launch </w:t>
+      </w:r>
+      <w:hyperlink r:id="rId6" w:history="1">
+        <w:r>
+          <w:rPr>
+            <w:rStyle w:val="Hyperlink"/>
+            <w:sz w:val="26"/>
+            <w:szCs w:val="24"/>
+            <w:lang w:val="en-US"/>
+          </w:rPr>
+          <w:t>https://www.echotrak.com/Login.aspx?ReturnUrl=%2f</w:t>
+        </w:r>
+      </w:hyperlink>
+    </w:p>
+    <w:p>
+      <w:pPr>
+        <w:pStyle w:val="ListParagraph"/>
+        <w:numPr>
+          <w:ilvl w:val="1"/>
+          <w:numId w:val="2"/>
+        </w:numPr>
+        <w:rPr>
+          <w:sz w:val="26"/>
+          <w:szCs w:val="24"/>
+          <w:lang w:val="en-US"/>
+        </w:rPr>
+      </w:pPr>
+      <w:r>
+        <w:rPr>
+          <w:sz w:val="26"/>
+          <w:szCs w:val="24"/>
+          <w:lang w:val="en-US"/>
+        </w:rPr>
+        <w:t>Enter user name</w:t>
+      </w:r>
+    </w:p>
+    <w:p>
+      <w:pPr>
+        <w:pStyle w:val="ListParagraph"/>
+        <w:numPr>
+          <w:ilvl w:val="1"/>
+          <w:numId w:val="2"/>
+        </w:numPr>
+        <w:rPr>
+          <w:sz w:val="26"/>
+          <w:szCs w:val="24"/>
+          <w:lang w:val="en-US"/>
+        </w:rPr>
+      </w:pPr>
+      <w:r>
+        <w:rPr>
+          <w:sz w:val="26"/>
+          <w:szCs w:val="24"/>
+          <w:lang w:val="en-US"/>
+        </w:rPr>
+        <w:t>Enter password</w:t>
+      </w:r>
+    </w:p>
+    <w:p>
+      <w:pPr>
+        <w:pStyle w:val="ListParagraph"/>
+        <w:numPr>
+          <w:ilvl w:val="1"/>
+          <w:numId w:val="2"/>
+        </w:numPr>
+        <w:rPr>
+          <w:sz w:val="26"/>
+          <w:szCs w:val="24"/>
+          <w:lang w:val="en-US"/>
+        </w:rPr>
+      </w:pPr>
+      <w:r>
+        <w:rPr>
+          <w:sz w:val="26"/>
+          <w:szCs w:val="24"/>
+          <w:lang w:val="en-US"/>
+        </w:rPr>
+        <w:t>Click on Login button</w:t>
+      </w:r>
+    </w:p>
+    <w:p>
+      <w:pPr>
+        <w:pStyle w:val="ListParagraph"/>
+        <w:numPr>
+          <w:ilvl w:val="1"/>
+          <w:numId w:val="2"/>
+        </w:numPr>
+        <w:rPr>
+          <w:sz w:val="26"/>
+          <w:szCs w:val="24"/>
+          <w:lang w:val="en-US"/>
+        </w:rPr>
+      </w:pPr>
+      <w:r>
+        <w:rPr>
+          <w:sz w:val="26"/>
+          <w:szCs w:val="24"/>
+          <w:lang w:val="en-US"/>
+        </w:rPr>
+        <w:t>Display the error message</w:t>
+      </w:r>
+      <w:r>
+        <w:rPr>
+          <w:sz w:val="26"/>
+          <w:szCs w:val="24"/>
+          <w:lang w:val="en-US"/>
+        </w:rPr>
+        <w:br/>
+      </w:r>
+      <w:r>
+        <w:rPr>
+          <w:b/>
+          <w:bCs/>
+          <w:sz w:val="26"/>
+          <w:szCs w:val="24"/>
+          <w:lang w:val="en-US"/>
+        </w:rPr>
+        <w:t xml:space="preserve">Use </w:t>
+      </w:r>
+      <w:r>
+        <w:rPr>
+          <w:b/>
+          <w:bCs/>
+          <w:sz w:val="26"/>
+          <w:szCs w:val="24"/>
+          <w:lang w:val="en-US"/>
+        </w:rPr>
+        <w:t>Name</w:t>
+      </w:r>
       <w:bookmarkStart w:id="0" w:name="_GoBack"/>
       <w:bookmarkEnd w:id="0"/>
+      <w:r>
+        <w:rPr>
+          <w:b/>
+          <w:bCs/>
+          <w:sz w:val="26"/>
+          <w:szCs w:val="24"/>
+          <w:lang w:val="en-US"/>
+        </w:rPr>
+        <w:t xml:space="preserve"> Locator</w:t>
+      </w:r>
+    </w:p>
+    <w:p>
+      <w:pPr>
+        <w:pStyle w:val="ListParagraph"/>
+        <w:numPr>
+          <w:ilvl w:val="0"/>
+          <w:numId w:val="2"/>
+        </w:numPr>
+        <w:rPr>
+          <w:sz w:val="26"/>
+          <w:szCs w:val="24"/>
+          <w:lang w:val="en-US"/>
+        </w:rPr>
+      </w:pPr>
     </w:p>
     <w:sectPr>
       <w:pgSz w:w="11906" w:h="16838"/>
@@ -1028,7 +1340,7 @@
         <w:rFonts w:hint="default"/>
       </w:rPr>
     </w:lvl>
-    <w:lvl w:ilvl="1" w:tplc="40090019" w:tentative="1">
+    <w:lvl w:ilvl="1" w:tplc="40090019">
       <w:start w:val="1"/>
       <w:numFmt w:val="lowerLetter"/>
       <w:lvlText w:val="%2."/>
@@ -1544,6 +1856,17 @@
       <w:contextualSpacing/>
     </w:pPr>
   </w:style>
+  <w:style w:type="character" w:styleId="Hyperlink">
+    <w:name w:val="Hyperlink"/>
+    <w:basedOn w:val="DefaultParagraphFont"/>
+    <w:uiPriority w:val="99"/>
+    <w:unhideWhenUsed/>
+    <w:rsid w:val="00095BDC"/>
+    <w:rPr>
+      <w:color w:val="0563C1" w:themeColor="hyperlink"/>
+      <w:u w:val="single"/>
+    </w:rPr>
+  </w:style>
 </w:styles>
 </file>
 

</xml_diff>

<commit_message>
Date: 18 Mar 2026
</commit_message>
<xml_diff>
--- a/Assignments.docx
+++ b/Assignments.docx
@@ -3045,6 +3045,759 @@
           <w:lang w:val="en-US"/>
         </w:rPr>
       </w:pPr>
+      <w:r>
+        <w:rPr>
+          <w:sz w:val="24"/>
+          <w:szCs w:val="24"/>
+          <w:highlight w:val="yellow"/>
+          <w:lang w:val="en-US"/>
+        </w:rPr>
+        <w:t>Display the 1</w:t>
+      </w:r>
+      <w:r>
+        <w:rPr>
+          <w:sz w:val="24"/>
+          <w:szCs w:val="24"/>
+          <w:highlight w:val="yellow"/>
+          <w:vertAlign w:val="superscript"/>
+          <w:lang w:val="en-US"/>
+        </w:rPr>
+        <w:t>st</w:t>
+      </w:r>
+      <w:r>
+        <w:rPr>
+          <w:sz w:val="24"/>
+          <w:szCs w:val="24"/>
+          <w:highlight w:val="yellow"/>
+          <w:lang w:val="en-US"/>
+        </w:rPr>
+        <w:t xml:space="preserve"> bus from list</w:t>
+      </w:r>
+    </w:p>
+    <w:p>
+      <w:pPr>
+        <w:pStyle w:val="ListParagraph"/>
+        <w:numPr>
+          <w:ilvl w:val="0"/>
+          <w:numId w:val="2"/>
+        </w:numPr>
+        <w:rPr>
+          <w:sz w:val="18"/>
+          <w:szCs w:val="16"/>
+          <w:lang w:val="en-US"/>
+        </w:rPr>
+      </w:pPr>
+      <w:r>
+        <w:rPr>
+          <w:sz w:val="24"/>
+          <w:szCs w:val="24"/>
+          <w:lang w:val="en-US"/>
+        </w:rPr>
+        <w:lastRenderedPageBreak/>
+        <w:t>Complete Assignment no 15 using Explicit Wait</w:t>
+      </w:r>
+      <w:r>
+        <w:rPr>
+          <w:sz w:val="24"/>
+          <w:szCs w:val="24"/>
+          <w:lang w:val="en-US"/>
+        </w:rPr>
+        <w:br/>
+      </w:r>
+      <w:r>
+        <w:rPr>
+          <w:rFonts w:ascii="Consolas" w:hAnsi="Consolas" w:cs="Consolas"/>
+          <w:color w:val="6A3E3E"/>
+          <w:sz w:val="24"/>
+          <w:szCs w:val="24"/>
+          <w:shd w:val="clear" w:color="auto" w:fill="E8F2FE"/>
+        </w:rPr>
+        <w:t>wait</w:t>
+      </w:r>
+      <w:r>
+        <w:rPr>
+          <w:rFonts w:ascii="Consolas" w:hAnsi="Consolas" w:cs="Consolas"/>
+          <w:color w:val="000000"/>
+          <w:sz w:val="24"/>
+          <w:szCs w:val="24"/>
+          <w:shd w:val="clear" w:color="auto" w:fill="E8F2FE"/>
+        </w:rPr>
+        <w:t>.until(ExpectedConditions.</w:t>
+      </w:r>
+      <w:r>
+        <w:rPr>
+          <w:rFonts w:ascii="Consolas" w:hAnsi="Consolas" w:cs="Consolas"/>
+          <w:i/>
+          <w:iCs/>
+          <w:color w:val="000000"/>
+          <w:sz w:val="24"/>
+          <w:szCs w:val="24"/>
+          <w:shd w:val="clear" w:color="auto" w:fill="E8F2FE"/>
+        </w:rPr>
+        <w:t>visibilityOfElementLocated</w:t>
+      </w:r>
+      <w:r>
+        <w:rPr>
+          <w:rFonts w:ascii="Consolas" w:hAnsi="Consolas" w:cs="Consolas"/>
+          <w:color w:val="000000"/>
+          <w:sz w:val="24"/>
+          <w:szCs w:val="24"/>
+          <w:shd w:val="clear" w:color="auto" w:fill="E8F2FE"/>
+        </w:rPr>
+        <w:t>(By.</w:t>
+      </w:r>
+      <w:r>
+        <w:rPr>
+          <w:rFonts w:ascii="Consolas" w:hAnsi="Consolas" w:cs="Consolas"/>
+          <w:i/>
+          <w:iCs/>
+          <w:color w:val="000000"/>
+          <w:sz w:val="24"/>
+          <w:szCs w:val="24"/>
+          <w:shd w:val="clear" w:color="auto" w:fill="E8F2FE"/>
+        </w:rPr>
+        <w:t>xpath</w:t>
+      </w:r>
+      <w:r>
+        <w:rPr>
+          <w:rFonts w:ascii="Consolas" w:hAnsi="Consolas" w:cs="Consolas"/>
+          <w:color w:val="000000"/>
+          <w:sz w:val="24"/>
+          <w:szCs w:val="24"/>
+          <w:shd w:val="clear" w:color="auto" w:fill="E8F2FE"/>
+        </w:rPr>
+        <w:t>(</w:t>
+      </w:r>
+      <w:r>
+        <w:rPr>
+          <w:rFonts w:ascii="Consolas" w:hAnsi="Consolas" w:cs="Consolas"/>
+          <w:color w:val="2A00FF"/>
+          <w:sz w:val="24"/>
+          <w:szCs w:val="24"/>
+          <w:shd w:val="clear" w:color="auto" w:fill="E8F2FE"/>
+        </w:rPr>
+        <w:t>""</w:t>
+      </w:r>
+      <w:r>
+        <w:rPr>
+          <w:rFonts w:ascii="Consolas" w:hAnsi="Consolas" w:cs="Consolas"/>
+          <w:color w:val="000000"/>
+          <w:sz w:val="24"/>
+          <w:szCs w:val="24"/>
+          <w:shd w:val="clear" w:color="auto" w:fill="E8F2FE"/>
+        </w:rPr>
+        <w:t>))).click();</w:t>
+      </w:r>
+    </w:p>
+    <w:p>
+      <w:pPr>
+        <w:pStyle w:val="ListParagraph"/>
+        <w:numPr>
+          <w:ilvl w:val="0"/>
+          <w:numId w:val="2"/>
+        </w:numPr>
+        <w:rPr>
+          <w:sz w:val="26"/>
+          <w:szCs w:val="24"/>
+          <w:lang w:val="en-US"/>
+        </w:rPr>
+      </w:pPr>
+      <w:r>
+        <w:rPr>
+          <w:sz w:val="24"/>
+          <w:szCs w:val="24"/>
+          <w:lang w:val="en-US"/>
+        </w:rPr>
+        <w:t>Complete Assignment no 15 using Fluent Wait</w:t>
+      </w:r>
+    </w:p>
+    <w:p>
+      <w:pPr>
+        <w:pStyle w:val="ListParagraph"/>
+        <w:numPr>
+          <w:ilvl w:val="0"/>
+          <w:numId w:val="2"/>
+        </w:numPr>
+        <w:rPr>
+          <w:sz w:val="26"/>
+          <w:szCs w:val="24"/>
+          <w:lang w:val="en-US"/>
+        </w:rPr>
+      </w:pPr>
+      <w:r>
+        <w:rPr>
+          <w:sz w:val="24"/>
+          <w:szCs w:val="24"/>
+          <w:lang w:val="en-US"/>
+        </w:rPr>
+        <w:t xml:space="preserve">Launch </w:t>
+      </w:r>
+      <w:hyperlink r:id="rId19" w:history="1">
+        <w:r>
+          <w:rPr>
+            <w:rStyle w:val="Hyperlink"/>
+            <w:sz w:val="24"/>
+            <w:szCs w:val="24"/>
+            <w:lang w:val="en-US"/>
+          </w:rPr>
+          <w:t>https://demo.guru99.com/test/web-table-element.php</w:t>
+        </w:r>
+      </w:hyperlink>
+    </w:p>
+    <w:p>
+      <w:pPr>
+        <w:pStyle w:val="ListParagraph"/>
+        <w:numPr>
+          <w:ilvl w:val="1"/>
+          <w:numId w:val="2"/>
+        </w:numPr>
+        <w:rPr>
+          <w:sz w:val="26"/>
+          <w:szCs w:val="24"/>
+          <w:lang w:val="en-US"/>
+        </w:rPr>
+      </w:pPr>
+      <w:r>
+        <w:rPr>
+          <w:sz w:val="24"/>
+          <w:szCs w:val="24"/>
+          <w:lang w:val="en-US"/>
+        </w:rPr>
+        <w:t>Read all current price</w:t>
+      </w:r>
+    </w:p>
+    <w:p>
+      <w:pPr>
+        <w:pStyle w:val="ListParagraph"/>
+        <w:numPr>
+          <w:ilvl w:val="1"/>
+          <w:numId w:val="2"/>
+        </w:numPr>
+        <w:rPr>
+          <w:sz w:val="26"/>
+          <w:szCs w:val="24"/>
+          <w:lang w:val="en-US"/>
+        </w:rPr>
+      </w:pPr>
+      <w:r>
+        <w:rPr>
+          <w:sz w:val="24"/>
+          <w:szCs w:val="24"/>
+          <w:lang w:val="en-US"/>
+        </w:rPr>
+        <w:t>Display highest price from the list</w:t>
+      </w:r>
+    </w:p>
+    <w:p>
+      <w:pPr>
+        <w:pStyle w:val="ListParagraph"/>
+        <w:numPr>
+          <w:ilvl w:val="2"/>
+          <w:numId w:val="2"/>
+        </w:numPr>
+        <w:rPr>
+          <w:sz w:val="26"/>
+          <w:szCs w:val="24"/>
+          <w:lang w:val="en-US"/>
+        </w:rPr>
+      </w:pPr>
+      <w:r>
+        <w:rPr>
+          <w:sz w:val="24"/>
+          <w:szCs w:val="24"/>
+          <w:lang w:val="en-US"/>
+        </w:rPr>
+        <w:t>Read all price list</w:t>
+      </w:r>
+    </w:p>
+    <w:p>
+      <w:pPr>
+        <w:pStyle w:val="ListParagraph"/>
+        <w:numPr>
+          <w:ilvl w:val="2"/>
+          <w:numId w:val="2"/>
+        </w:numPr>
+        <w:rPr>
+          <w:sz w:val="26"/>
+          <w:szCs w:val="24"/>
+          <w:lang w:val="en-US"/>
+        </w:rPr>
+      </w:pPr>
+      <w:r>
+        <w:rPr>
+          <w:sz w:val="24"/>
+          <w:szCs w:val="24"/>
+          <w:lang w:val="en-US"/>
+        </w:rPr>
+        <w:t>Store in List&lt;WebElement&gt;</w:t>
+      </w:r>
+    </w:p>
+    <w:p>
+      <w:pPr>
+        <w:pStyle w:val="ListParagraph"/>
+        <w:numPr>
+          <w:ilvl w:val="2"/>
+          <w:numId w:val="2"/>
+        </w:numPr>
+        <w:rPr>
+          <w:sz w:val="26"/>
+          <w:szCs w:val="24"/>
+          <w:lang w:val="en-US"/>
+        </w:rPr>
+      </w:pPr>
+      <w:r>
+        <w:rPr>
+          <w:sz w:val="24"/>
+          <w:szCs w:val="24"/>
+          <w:lang w:val="en-US"/>
+        </w:rPr>
+        <w:t>Read one by one text and store in array</w:t>
+      </w:r>
+    </w:p>
+    <w:p>
+      <w:pPr>
+        <w:pStyle w:val="ListParagraph"/>
+        <w:numPr>
+          <w:ilvl w:val="2"/>
+          <w:numId w:val="2"/>
+        </w:numPr>
+        <w:rPr>
+          <w:sz w:val="26"/>
+          <w:szCs w:val="24"/>
+          <w:lang w:val="en-US"/>
+        </w:rPr>
+      </w:pPr>
+      <w:r>
+        <w:rPr>
+          <w:sz w:val="24"/>
+          <w:szCs w:val="24"/>
+          <w:lang w:val="en-US"/>
+        </w:rPr>
+        <w:t>Sort this array so you will get highest price</w:t>
+      </w:r>
+    </w:p>
+    <w:p>
+      <w:pPr>
+        <w:pStyle w:val="ListParagraph"/>
+        <w:numPr>
+          <w:ilvl w:val="0"/>
+          <w:numId w:val="2"/>
+        </w:numPr>
+        <w:spacing w:line="252" w:lineRule="auto"/>
+        <w:rPr>
+          <w:sz w:val="24"/>
+          <w:szCs w:val="24"/>
+          <w:highlight w:val="yellow"/>
+          <w:lang w:val="en-US"/>
+        </w:rPr>
+      </w:pPr>
+      <w:r>
+        <w:rPr>
+          <w:sz w:val="24"/>
+          <w:szCs w:val="24"/>
+          <w:highlight w:val="yellow"/>
+          <w:lang w:val="en-US"/>
+        </w:rPr>
+        <w:t xml:space="preserve">Open </w:t>
+      </w:r>
+      <w:hyperlink r:id="rId20" w:history="1">
+        <w:r>
+          <w:rPr>
+            <w:rStyle w:val="Hyperlink"/>
+            <w:sz w:val="24"/>
+            <w:szCs w:val="24"/>
+            <w:highlight w:val="yellow"/>
+            <w:lang w:val="en-US"/>
+          </w:rPr>
+          <w:t>https://opensource-demo.orangehrmlive.com/web/index.php/auth/login</w:t>
+        </w:r>
+      </w:hyperlink>
+    </w:p>
+    <w:p>
+      <w:pPr>
+        <w:pStyle w:val="ListParagraph"/>
+        <w:numPr>
+          <w:ilvl w:val="1"/>
+          <w:numId w:val="2"/>
+        </w:numPr>
+        <w:spacing w:line="252" w:lineRule="auto"/>
+        <w:rPr>
+          <w:sz w:val="24"/>
+          <w:szCs w:val="24"/>
+          <w:highlight w:val="yellow"/>
+          <w:lang w:val="en-US"/>
+        </w:rPr>
+      </w:pPr>
+      <w:r>
+        <w:rPr>
+          <w:sz w:val="24"/>
+          <w:szCs w:val="24"/>
+          <w:highlight w:val="yellow"/>
+          <w:lang w:val="en-US"/>
+        </w:rPr>
+        <w:t>Login with Admin (admin, admin123)</w:t>
+      </w:r>
+    </w:p>
+    <w:p>
+      <w:pPr>
+        <w:pStyle w:val="ListParagraph"/>
+        <w:numPr>
+          <w:ilvl w:val="1"/>
+          <w:numId w:val="2"/>
+        </w:numPr>
+        <w:spacing w:line="252" w:lineRule="auto"/>
+        <w:rPr>
+          <w:sz w:val="24"/>
+          <w:szCs w:val="24"/>
+          <w:highlight w:val="yellow"/>
+          <w:lang w:val="en-US"/>
+        </w:rPr>
+      </w:pPr>
+      <w:r>
+        <w:rPr>
+          <w:sz w:val="24"/>
+          <w:szCs w:val="24"/>
+          <w:highlight w:val="yellow"/>
+          <w:lang w:val="en-US"/>
+        </w:rPr>
+        <w:t>Click on PIM</w:t>
+      </w:r>
+    </w:p>
+    <w:p>
+      <w:pPr>
+        <w:pStyle w:val="ListParagraph"/>
+        <w:numPr>
+          <w:ilvl w:val="1"/>
+          <w:numId w:val="2"/>
+        </w:numPr>
+        <w:spacing w:line="252" w:lineRule="auto"/>
+        <w:rPr>
+          <w:sz w:val="24"/>
+          <w:szCs w:val="24"/>
+          <w:highlight w:val="yellow"/>
+          <w:lang w:val="en-US"/>
+        </w:rPr>
+      </w:pPr>
+      <w:r>
+        <w:rPr>
+          <w:sz w:val="24"/>
+          <w:szCs w:val="24"/>
+          <w:highlight w:val="yellow"/>
+          <w:lang w:val="en-US"/>
+        </w:rPr>
+        <w:t>Click on + Add button</w:t>
+      </w:r>
+    </w:p>
+    <w:p>
+      <w:pPr>
+        <w:pStyle w:val="ListParagraph"/>
+        <w:numPr>
+          <w:ilvl w:val="1"/>
+          <w:numId w:val="2"/>
+        </w:numPr>
+        <w:spacing w:line="252" w:lineRule="auto"/>
+        <w:rPr>
+          <w:sz w:val="24"/>
+          <w:szCs w:val="24"/>
+          <w:highlight w:val="yellow"/>
+          <w:lang w:val="en-US"/>
+        </w:rPr>
+      </w:pPr>
+      <w:r>
+        <w:rPr>
+          <w:sz w:val="24"/>
+          <w:szCs w:val="24"/>
+          <w:highlight w:val="yellow"/>
+          <w:lang w:val="en-US"/>
+        </w:rPr>
+        <w:t>Enter First Name</w:t>
+      </w:r>
+    </w:p>
+    <w:p>
+      <w:pPr>
+        <w:pStyle w:val="ListParagraph"/>
+        <w:numPr>
+          <w:ilvl w:val="1"/>
+          <w:numId w:val="2"/>
+        </w:numPr>
+        <w:spacing w:line="252" w:lineRule="auto"/>
+        <w:rPr>
+          <w:sz w:val="24"/>
+          <w:szCs w:val="24"/>
+          <w:highlight w:val="yellow"/>
+          <w:lang w:val="en-US"/>
+        </w:rPr>
+      </w:pPr>
+      <w:r>
+        <w:rPr>
+          <w:sz w:val="24"/>
+          <w:szCs w:val="24"/>
+          <w:highlight w:val="yellow"/>
+          <w:lang w:val="en-US"/>
+        </w:rPr>
+        <w:t>Enter Middle Name</w:t>
+      </w:r>
+    </w:p>
+    <w:p>
+      <w:pPr>
+        <w:pStyle w:val="ListParagraph"/>
+        <w:numPr>
+          <w:ilvl w:val="1"/>
+          <w:numId w:val="2"/>
+        </w:numPr>
+        <w:spacing w:line="252" w:lineRule="auto"/>
+        <w:rPr>
+          <w:sz w:val="24"/>
+          <w:szCs w:val="24"/>
+          <w:highlight w:val="yellow"/>
+          <w:lang w:val="en-US"/>
+        </w:rPr>
+      </w:pPr>
+      <w:r>
+        <w:rPr>
+          <w:sz w:val="24"/>
+          <w:szCs w:val="24"/>
+          <w:highlight w:val="yellow"/>
+          <w:lang w:val="en-US"/>
+        </w:rPr>
+        <w:t>Enter Last Name</w:t>
+      </w:r>
+    </w:p>
+    <w:p>
+      <w:pPr>
+        <w:pStyle w:val="ListParagraph"/>
+        <w:numPr>
+          <w:ilvl w:val="1"/>
+          <w:numId w:val="2"/>
+        </w:numPr>
+        <w:spacing w:line="252" w:lineRule="auto"/>
+        <w:rPr>
+          <w:sz w:val="24"/>
+          <w:szCs w:val="24"/>
+          <w:highlight w:val="yellow"/>
+          <w:lang w:val="en-US"/>
+        </w:rPr>
+      </w:pPr>
+      <w:r>
+        <w:rPr>
+          <w:sz w:val="24"/>
+          <w:szCs w:val="24"/>
+          <w:highlight w:val="yellow"/>
+          <w:lang w:val="en-US"/>
+        </w:rPr>
+        <w:t>Click on Create Login Details</w:t>
+      </w:r>
+    </w:p>
+    <w:p>
+      <w:pPr>
+        <w:pStyle w:val="ListParagraph"/>
+        <w:numPr>
+          <w:ilvl w:val="1"/>
+          <w:numId w:val="2"/>
+        </w:numPr>
+        <w:spacing w:line="252" w:lineRule="auto"/>
+        <w:rPr>
+          <w:sz w:val="24"/>
+          <w:szCs w:val="24"/>
+          <w:highlight w:val="yellow"/>
+          <w:lang w:val="en-US"/>
+        </w:rPr>
+      </w:pPr>
+      <w:r>
+        <w:rPr>
+          <w:sz w:val="24"/>
+          <w:szCs w:val="24"/>
+          <w:highlight w:val="yellow"/>
+          <w:lang w:val="en-US"/>
+        </w:rPr>
+        <w:t>Enter User Name</w:t>
+      </w:r>
+    </w:p>
+    <w:p>
+      <w:pPr>
+        <w:pStyle w:val="ListParagraph"/>
+        <w:numPr>
+          <w:ilvl w:val="1"/>
+          <w:numId w:val="2"/>
+        </w:numPr>
+        <w:spacing w:line="252" w:lineRule="auto"/>
+        <w:rPr>
+          <w:sz w:val="24"/>
+          <w:szCs w:val="24"/>
+          <w:highlight w:val="yellow"/>
+          <w:lang w:val="en-US"/>
+        </w:rPr>
+      </w:pPr>
+      <w:r>
+        <w:rPr>
+          <w:sz w:val="24"/>
+          <w:szCs w:val="24"/>
+          <w:highlight w:val="yellow"/>
+          <w:lang w:val="en-US"/>
+        </w:rPr>
+        <w:t>Enter Password</w:t>
+      </w:r>
+    </w:p>
+    <w:p>
+      <w:pPr>
+        <w:pStyle w:val="ListParagraph"/>
+        <w:numPr>
+          <w:ilvl w:val="1"/>
+          <w:numId w:val="2"/>
+        </w:numPr>
+        <w:spacing w:line="252" w:lineRule="auto"/>
+        <w:rPr>
+          <w:sz w:val="24"/>
+          <w:szCs w:val="24"/>
+          <w:highlight w:val="yellow"/>
+          <w:lang w:val="en-US"/>
+        </w:rPr>
+      </w:pPr>
+      <w:r>
+        <w:rPr>
+          <w:sz w:val="24"/>
+          <w:szCs w:val="24"/>
+          <w:highlight w:val="yellow"/>
+          <w:lang w:val="en-US"/>
+        </w:rPr>
+        <w:t>Enter Confirm Password</w:t>
+      </w:r>
+    </w:p>
+    <w:p>
+      <w:pPr>
+        <w:pStyle w:val="ListParagraph"/>
+        <w:numPr>
+          <w:ilvl w:val="1"/>
+          <w:numId w:val="2"/>
+        </w:numPr>
+        <w:spacing w:line="252" w:lineRule="auto"/>
+        <w:rPr>
+          <w:sz w:val="24"/>
+          <w:szCs w:val="24"/>
+          <w:highlight w:val="yellow"/>
+          <w:lang w:val="en-US"/>
+        </w:rPr>
+      </w:pPr>
+      <w:r>
+        <w:rPr>
+          <w:sz w:val="24"/>
+          <w:szCs w:val="24"/>
+          <w:highlight w:val="yellow"/>
+          <w:lang w:val="en-US"/>
+        </w:rPr>
+        <w:t>Click on Save Button</w:t>
+      </w:r>
+    </w:p>
+    <w:p>
+      <w:pPr>
+        <w:pStyle w:val="ListParagraph"/>
+        <w:numPr>
+          <w:ilvl w:val="1"/>
+          <w:numId w:val="2"/>
+        </w:numPr>
+        <w:spacing w:line="252" w:lineRule="auto"/>
+        <w:rPr>
+          <w:sz w:val="24"/>
+          <w:szCs w:val="24"/>
+          <w:highlight w:val="yellow"/>
+          <w:lang w:val="en-US"/>
+        </w:rPr>
+      </w:pPr>
+      <w:r>
+        <w:rPr>
+          <w:sz w:val="24"/>
+          <w:szCs w:val="24"/>
+          <w:highlight w:val="yellow"/>
+          <w:lang w:val="en-US"/>
+        </w:rPr>
+        <w:t>Logout</w:t>
+      </w:r>
+    </w:p>
+    <w:p>
+      <w:pPr>
+        <w:pStyle w:val="ListParagraph"/>
+        <w:numPr>
+          <w:ilvl w:val="1"/>
+          <w:numId w:val="2"/>
+        </w:numPr>
+        <w:spacing w:line="252" w:lineRule="auto"/>
+        <w:rPr>
+          <w:sz w:val="24"/>
+          <w:szCs w:val="24"/>
+          <w:highlight w:val="yellow"/>
+          <w:lang w:val="en-US"/>
+        </w:rPr>
+      </w:pPr>
+      <w:r>
+        <w:rPr>
+          <w:sz w:val="24"/>
+          <w:szCs w:val="24"/>
+          <w:highlight w:val="yellow"/>
+          <w:lang w:val="en-US"/>
+        </w:rPr>
+        <w:t xml:space="preserve">Login using data provided in step no h &amp; </w:t>
+      </w:r>
+      <w:proofErr w:type="spellStart"/>
+      <w:r>
+        <w:rPr>
+          <w:sz w:val="24"/>
+          <w:szCs w:val="24"/>
+          <w:highlight w:val="yellow"/>
+          <w:lang w:val="en-US"/>
+        </w:rPr>
+        <w:t>i</w:t>
+      </w:r>
+      <w:proofErr w:type="spellEnd"/>
+    </w:p>
+    <w:p>
+      <w:pPr>
+        <w:pStyle w:val="ListParagraph"/>
+        <w:numPr>
+          <w:ilvl w:val="1"/>
+          <w:numId w:val="2"/>
+        </w:numPr>
+        <w:spacing w:line="252" w:lineRule="auto"/>
+        <w:rPr>
+          <w:sz w:val="24"/>
+          <w:szCs w:val="24"/>
+          <w:highlight w:val="yellow"/>
+          <w:lang w:val="en-US"/>
+        </w:rPr>
+      </w:pPr>
+      <w:r>
+        <w:rPr>
+          <w:sz w:val="24"/>
+          <w:szCs w:val="24"/>
+          <w:highlight w:val="yellow"/>
+          <w:lang w:val="en-US"/>
+        </w:rPr>
+        <w:t>Display name of employee on logout link</w:t>
+      </w:r>
+    </w:p>
+    <w:p>
+      <w:pPr>
+        <w:pStyle w:val="ListParagraph"/>
+        <w:numPr>
+          <w:ilvl w:val="1"/>
+          <w:numId w:val="2"/>
+        </w:numPr>
+        <w:spacing w:line="252" w:lineRule="auto"/>
+        <w:rPr>
+          <w:sz w:val="24"/>
+          <w:szCs w:val="24"/>
+          <w:highlight w:val="yellow"/>
+          <w:lang w:val="en-US"/>
+        </w:rPr>
+      </w:pPr>
+      <w:r>
+        <w:rPr>
+          <w:sz w:val="24"/>
+          <w:szCs w:val="24"/>
+          <w:highlight w:val="yellow"/>
+          <w:lang w:val="en-US"/>
+        </w:rPr>
+        <w:t xml:space="preserve">Click on </w:t>
+      </w:r>
       <w:bookmarkStart w:id="0" w:name="_GoBack"/>
       <w:bookmarkEnd w:id="0"/>
       <w:r>
@@ -3054,28 +3807,548 @@
           <w:highlight w:val="yellow"/>
           <w:lang w:val="en-US"/>
         </w:rPr>
+        <w:t>My Info</w:t>
+      </w:r>
+    </w:p>
+    <w:p>
+      <w:pPr>
+        <w:pStyle w:val="ListParagraph"/>
+        <w:numPr>
+          <w:ilvl w:val="1"/>
+          <w:numId w:val="2"/>
+        </w:numPr>
+        <w:spacing w:line="252" w:lineRule="auto"/>
+        <w:rPr>
+          <w:sz w:val="24"/>
+          <w:szCs w:val="24"/>
+          <w:highlight w:val="yellow"/>
+          <w:lang w:val="en-US"/>
+        </w:rPr>
+      </w:pPr>
+      <w:r>
+        <w:rPr>
+          <w:sz w:val="24"/>
+          <w:szCs w:val="24"/>
+          <w:highlight w:val="yellow"/>
+          <w:lang w:val="en-US"/>
+        </w:rPr>
+        <w:t>Display the Employee ID</w:t>
+      </w:r>
+    </w:p>
+    <w:p>
+      <w:pPr>
+        <w:pStyle w:val="ListParagraph"/>
+        <w:numPr>
+          <w:ilvl w:val="1"/>
+          <w:numId w:val="2"/>
+        </w:numPr>
+        <w:spacing w:line="252" w:lineRule="auto"/>
+        <w:rPr>
+          <w:sz w:val="24"/>
+          <w:szCs w:val="24"/>
+          <w:highlight w:val="yellow"/>
+          <w:lang w:val="en-US"/>
+        </w:rPr>
+      </w:pPr>
+      <w:r>
+        <w:rPr>
+          <w:sz w:val="24"/>
+          <w:szCs w:val="24"/>
+          <w:highlight w:val="yellow"/>
+          <w:lang w:val="en-US"/>
+        </w:rPr>
+        <w:t>Logout</w:t>
+      </w:r>
+    </w:p>
+    <w:p>
+      <w:pPr>
+        <w:pStyle w:val="ListParagraph"/>
+        <w:numPr>
+          <w:ilvl w:val="1"/>
+          <w:numId w:val="2"/>
+        </w:numPr>
+        <w:spacing w:line="252" w:lineRule="auto"/>
+        <w:rPr>
+          <w:sz w:val="24"/>
+          <w:szCs w:val="24"/>
+          <w:highlight w:val="yellow"/>
+          <w:lang w:val="en-US"/>
+        </w:rPr>
+      </w:pPr>
+      <w:r>
+        <w:rPr>
+          <w:sz w:val="24"/>
+          <w:szCs w:val="24"/>
+          <w:highlight w:val="yellow"/>
+          <w:lang w:val="en-US"/>
+        </w:rPr>
+        <w:t>Login with admin</w:t>
+      </w:r>
+    </w:p>
+    <w:p>
+      <w:pPr>
+        <w:pStyle w:val="ListParagraph"/>
+        <w:numPr>
+          <w:ilvl w:val="1"/>
+          <w:numId w:val="2"/>
+        </w:numPr>
+        <w:spacing w:line="252" w:lineRule="auto"/>
+        <w:rPr>
+          <w:sz w:val="24"/>
+          <w:szCs w:val="24"/>
+          <w:highlight w:val="yellow"/>
+          <w:lang w:val="en-US"/>
+        </w:rPr>
+      </w:pPr>
+      <w:r>
+        <w:rPr>
+          <w:sz w:val="24"/>
+          <w:szCs w:val="24"/>
+          <w:highlight w:val="yellow"/>
+          <w:lang w:val="en-US"/>
+        </w:rPr>
+        <w:t>Click on Admin</w:t>
+      </w:r>
+    </w:p>
+    <w:p>
+      <w:pPr>
+        <w:pStyle w:val="ListParagraph"/>
+        <w:numPr>
+          <w:ilvl w:val="1"/>
+          <w:numId w:val="2"/>
+        </w:numPr>
+        <w:spacing w:line="252" w:lineRule="auto"/>
+        <w:rPr>
+          <w:sz w:val="24"/>
+          <w:szCs w:val="24"/>
+          <w:highlight w:val="yellow"/>
+          <w:lang w:val="en-US"/>
+        </w:rPr>
+      </w:pPr>
+      <w:r>
+        <w:rPr>
+          <w:sz w:val="24"/>
+          <w:szCs w:val="24"/>
+          <w:highlight w:val="yellow"/>
+          <w:lang w:val="en-US"/>
+        </w:rPr>
+        <w:t>Enter user name</w:t>
+      </w:r>
+    </w:p>
+    <w:p>
+      <w:pPr>
+        <w:pStyle w:val="ListParagraph"/>
+        <w:numPr>
+          <w:ilvl w:val="1"/>
+          <w:numId w:val="2"/>
+        </w:numPr>
+        <w:spacing w:line="252" w:lineRule="auto"/>
+        <w:rPr>
+          <w:sz w:val="24"/>
+          <w:szCs w:val="24"/>
+          <w:highlight w:val="yellow"/>
+          <w:lang w:val="en-US"/>
+        </w:rPr>
+      </w:pPr>
+      <w:r>
+        <w:rPr>
+          <w:sz w:val="24"/>
+          <w:szCs w:val="24"/>
+          <w:highlight w:val="yellow"/>
+          <w:lang w:val="en-US"/>
+        </w:rPr>
+        <w:t xml:space="preserve">Click on Search </w:t>
+      </w:r>
+    </w:p>
+    <w:p>
+      <w:pPr>
+        <w:pStyle w:val="ListParagraph"/>
+        <w:numPr>
+          <w:ilvl w:val="1"/>
+          <w:numId w:val="2"/>
+        </w:numPr>
+        <w:spacing w:line="252" w:lineRule="auto"/>
+        <w:rPr>
+          <w:sz w:val="24"/>
+          <w:szCs w:val="24"/>
+          <w:highlight w:val="yellow"/>
+          <w:lang w:val="en-US"/>
+        </w:rPr>
+      </w:pPr>
+      <w:r>
+        <w:rPr>
+          <w:sz w:val="24"/>
+          <w:szCs w:val="24"/>
+          <w:highlight w:val="yellow"/>
+          <w:lang w:val="en-US"/>
+        </w:rPr>
+        <w:t>Delete the record displayed</w:t>
+      </w:r>
+    </w:p>
+    <w:p>
+      <w:pPr>
+        <w:pStyle w:val="ListParagraph"/>
+        <w:numPr>
+          <w:ilvl w:val="1"/>
+          <w:numId w:val="2"/>
+        </w:numPr>
+        <w:spacing w:line="256" w:lineRule="auto"/>
+        <w:rPr>
+          <w:sz w:val="24"/>
+          <w:szCs w:val="22"/>
+          <w:lang w:val="en-US"/>
+        </w:rPr>
+      </w:pPr>
+      <w:r>
+        <w:rPr>
+          <w:sz w:val="24"/>
+          <w:szCs w:val="24"/>
+          <w:highlight w:val="yellow"/>
+          <w:lang w:val="en-US"/>
+        </w:rPr>
+        <w:t>Logout</w:t>
+      </w:r>
+      <w:r>
+        <w:rPr>
+          <w:sz w:val="24"/>
+          <w:szCs w:val="24"/>
+          <w:lang w:val="en-US"/>
+        </w:rPr>
+        <w:tab/>
+      </w:r>
+    </w:p>
+    <w:p>
+      <w:pPr>
+        <w:pStyle w:val="ListParagraph"/>
+        <w:numPr>
+          <w:ilvl w:val="0"/>
+          <w:numId w:val="2"/>
+        </w:numPr>
+        <w:spacing w:line="252" w:lineRule="auto"/>
+        <w:rPr>
+          <w:sz w:val="24"/>
+          <w:szCs w:val="24"/>
+          <w:lang w:val="en-US"/>
+        </w:rPr>
+      </w:pPr>
+      <w:r>
+        <w:rPr>
+          <w:sz w:val="24"/>
+          <w:szCs w:val="24"/>
+          <w:lang w:val="en-US"/>
+        </w:rPr>
+        <w:t xml:space="preserve">Open </w:t>
+      </w:r>
+      <w:hyperlink r:id="rId21" w:history="1">
+        <w:r>
+          <w:rPr>
+            <w:rStyle w:val="Hyperlink"/>
+            <w:sz w:val="24"/>
+            <w:szCs w:val="24"/>
+            <w:lang w:val="en-US"/>
+          </w:rPr>
+          <w:t>https://demoqa.com/webtables</w:t>
+        </w:r>
+      </w:hyperlink>
+      <w:r>
+        <w:rPr>
+          <w:sz w:val="24"/>
+          <w:szCs w:val="24"/>
+          <w:lang w:val="en-US"/>
+        </w:rPr>
+        <w:t xml:space="preserve"> </w:t>
+      </w:r>
+    </w:p>
+    <w:p>
+      <w:pPr>
+        <w:pStyle w:val="ListParagraph"/>
+        <w:numPr>
+          <w:ilvl w:val="1"/>
+          <w:numId w:val="2"/>
+        </w:numPr>
+        <w:spacing w:line="252" w:lineRule="auto"/>
+        <w:rPr>
+          <w:sz w:val="24"/>
+          <w:szCs w:val="24"/>
+          <w:lang w:val="en-US"/>
+        </w:rPr>
+      </w:pPr>
+      <w:r>
+        <w:rPr>
+          <w:sz w:val="24"/>
+          <w:szCs w:val="24"/>
+          <w:lang w:val="en-US"/>
+        </w:rPr>
+        <w:t>Try to display all header columns</w:t>
+      </w:r>
+    </w:p>
+    <w:p>
+      <w:pPr>
+        <w:pStyle w:val="ListParagraph"/>
+        <w:numPr>
+          <w:ilvl w:val="1"/>
+          <w:numId w:val="2"/>
+        </w:numPr>
+        <w:spacing w:line="252" w:lineRule="auto"/>
+        <w:rPr>
+          <w:sz w:val="24"/>
+          <w:szCs w:val="24"/>
+          <w:lang w:val="en-US"/>
+        </w:rPr>
+      </w:pPr>
+      <w:r>
+        <w:rPr>
+          <w:sz w:val="24"/>
+          <w:szCs w:val="24"/>
+          <w:lang w:val="en-US"/>
+        </w:rPr>
+        <w:t>Click on Add button</w:t>
+      </w:r>
+    </w:p>
+    <w:p>
+      <w:pPr>
+        <w:pStyle w:val="ListParagraph"/>
+        <w:numPr>
+          <w:ilvl w:val="1"/>
+          <w:numId w:val="2"/>
+        </w:numPr>
+        <w:spacing w:line="252" w:lineRule="auto"/>
+        <w:rPr>
+          <w:sz w:val="24"/>
+          <w:szCs w:val="24"/>
+          <w:lang w:val="en-US"/>
+        </w:rPr>
+      </w:pPr>
+      <w:r>
+        <w:rPr>
+          <w:sz w:val="24"/>
+          <w:szCs w:val="24"/>
+          <w:lang w:val="en-US"/>
+        </w:rPr>
+        <w:t>Enter all the data</w:t>
+      </w:r>
+    </w:p>
+    <w:p>
+      <w:pPr>
+        <w:pStyle w:val="ListParagraph"/>
+        <w:numPr>
+          <w:ilvl w:val="1"/>
+          <w:numId w:val="2"/>
+        </w:numPr>
+        <w:spacing w:line="252" w:lineRule="auto"/>
+        <w:rPr>
+          <w:sz w:val="24"/>
+          <w:szCs w:val="24"/>
+          <w:lang w:val="en-US"/>
+        </w:rPr>
+      </w:pPr>
+      <w:r>
+        <w:rPr>
+          <w:sz w:val="24"/>
+          <w:szCs w:val="24"/>
+          <w:lang w:val="en-US"/>
+        </w:rPr>
+        <w:t>Search the first name in First Name column</w:t>
+      </w:r>
+    </w:p>
+    <w:p>
+      <w:pPr>
+        <w:pStyle w:val="ListParagraph"/>
+        <w:numPr>
+          <w:ilvl w:val="1"/>
+          <w:numId w:val="2"/>
+        </w:numPr>
+        <w:spacing w:line="252" w:lineRule="auto"/>
+        <w:rPr>
+          <w:sz w:val="24"/>
+          <w:szCs w:val="24"/>
+          <w:lang w:val="en-US"/>
+        </w:rPr>
+      </w:pPr>
+      <w:r>
+        <w:rPr>
+          <w:sz w:val="24"/>
+          <w:szCs w:val="24"/>
+          <w:lang w:val="en-US"/>
+        </w:rPr>
+        <w:t>Click on delete button in the same row (Don’t copy the xpath of delete button from last row)</w:t>
+      </w:r>
+    </w:p>
+    <w:p>
+      <w:pPr>
+        <w:pStyle w:val="ListParagraph"/>
+        <w:numPr>
+          <w:ilvl w:val="0"/>
+          <w:numId w:val="2"/>
+        </w:numPr>
+        <w:spacing w:line="252" w:lineRule="auto"/>
+        <w:rPr>
+          <w:sz w:val="24"/>
+          <w:szCs w:val="24"/>
+          <w:lang w:val="en-US"/>
+        </w:rPr>
+      </w:pPr>
+      <w:r>
+        <w:rPr>
+          <w:sz w:val="24"/>
+          <w:szCs w:val="24"/>
+          <w:lang w:val="en-US"/>
+        </w:rPr>
+        <w:t xml:space="preserve">Open </w:t>
+      </w:r>
+      <w:hyperlink r:id="rId22" w:history="1">
+        <w:r>
+          <w:rPr>
+            <w:rStyle w:val="Hyperlink"/>
+            <w:sz w:val="24"/>
+            <w:szCs w:val="24"/>
+            <w:lang w:val="en-US"/>
+          </w:rPr>
+          <w:t>https://www.iplt20.com/points-table/men/2024</w:t>
+        </w:r>
+      </w:hyperlink>
+      <w:r>
+        <w:rPr>
+          <w:sz w:val="24"/>
+          <w:szCs w:val="24"/>
+          <w:lang w:val="en-US"/>
+        </w:rPr>
+        <w:t xml:space="preserve"> </w:t>
+      </w:r>
+    </w:p>
+    <w:p>
+      <w:pPr>
+        <w:pStyle w:val="ListParagraph"/>
+        <w:numPr>
+          <w:ilvl w:val="1"/>
+          <w:numId w:val="2"/>
+        </w:numPr>
+        <w:spacing w:line="252" w:lineRule="auto"/>
+        <w:rPr>
+          <w:sz w:val="24"/>
+          <w:szCs w:val="24"/>
+          <w:lang w:val="en-US"/>
+        </w:rPr>
+      </w:pPr>
+      <w:r>
+        <w:rPr>
+          <w:sz w:val="24"/>
+          <w:szCs w:val="24"/>
+          <w:lang w:val="en-US"/>
+        </w:rPr>
+        <w:t>Display list of all the Teams</w:t>
+      </w:r>
+    </w:p>
+    <w:p>
+      <w:pPr>
+        <w:pStyle w:val="ListParagraph"/>
+        <w:numPr>
+          <w:ilvl w:val="1"/>
+          <w:numId w:val="2"/>
+        </w:numPr>
+        <w:spacing w:line="252" w:lineRule="auto"/>
+        <w:rPr>
+          <w:sz w:val="24"/>
+          <w:szCs w:val="24"/>
+          <w:lang w:val="en-US"/>
+        </w:rPr>
+      </w:pPr>
+      <w:r>
+        <w:rPr>
+          <w:sz w:val="24"/>
+          <w:szCs w:val="24"/>
+          <w:lang w:val="en-US"/>
+        </w:rPr>
         <w:lastRenderedPageBreak/>
-        <w:t>Display the 1</w:t>
-      </w:r>
-      <w:r>
-        <w:rPr>
-          <w:sz w:val="24"/>
-          <w:szCs w:val="24"/>
-          <w:highlight w:val="yellow"/>
-          <w:vertAlign w:val="superscript"/>
-          <w:lang w:val="en-US"/>
-        </w:rPr>
-        <w:t>st</w:t>
-      </w:r>
-      <w:r>
-        <w:rPr>
-          <w:sz w:val="24"/>
-          <w:szCs w:val="24"/>
-          <w:highlight w:val="yellow"/>
-          <w:lang w:val="en-US"/>
-        </w:rPr>
-        <w:t xml:space="preserve"> bus from list</w:t>
-      </w:r>
+        <w:t>Display all result of each team about N W L</w:t>
+      </w:r>
+    </w:p>
+    <w:p>
+      <w:pPr>
+        <w:pStyle w:val="ListParagraph"/>
+        <w:numPr>
+          <w:ilvl w:val="1"/>
+          <w:numId w:val="2"/>
+        </w:numPr>
+        <w:spacing w:line="252" w:lineRule="auto"/>
+        <w:rPr>
+          <w:sz w:val="24"/>
+          <w:szCs w:val="24"/>
+          <w:lang w:val="en-US"/>
+        </w:rPr>
+      </w:pPr>
+      <w:r>
+        <w:rPr>
+          <w:sz w:val="24"/>
+          <w:szCs w:val="24"/>
+          <w:lang w:val="en-US"/>
+        </w:rPr>
+        <w:t>Display count of N, W &amp; L</w:t>
+      </w:r>
+    </w:p>
+    <w:p>
+      <w:pPr>
+        <w:pStyle w:val="ListParagraph"/>
+        <w:numPr>
+          <w:ilvl w:val="1"/>
+          <w:numId w:val="2"/>
+        </w:numPr>
+        <w:spacing w:line="252" w:lineRule="auto"/>
+        <w:rPr>
+          <w:sz w:val="24"/>
+          <w:szCs w:val="24"/>
+          <w:lang w:val="en-US"/>
+        </w:rPr>
+      </w:pPr>
+      <w:r>
+        <w:rPr>
+          <w:sz w:val="24"/>
+          <w:szCs w:val="24"/>
+          <w:lang w:val="en-US"/>
+        </w:rPr>
+        <w:t>Display the result as follow</w:t>
+      </w:r>
+      <w:r>
+        <w:rPr>
+          <w:sz w:val="24"/>
+          <w:szCs w:val="24"/>
+          <w:lang w:val="en-US"/>
+        </w:rPr>
+        <w:br/>
+        <w:t>KKR</w:t>
+      </w:r>
+      <w:r>
+        <w:rPr>
+          <w:sz w:val="24"/>
+          <w:szCs w:val="24"/>
+          <w:lang w:val="en-US"/>
+        </w:rPr>
+        <w:tab/>
+        <w:t>NNWWW</w:t>
+      </w:r>
+      <w:r>
+        <w:rPr>
+          <w:sz w:val="24"/>
+          <w:szCs w:val="24"/>
+          <w:lang w:val="en-US"/>
+        </w:rPr>
+        <w:tab/>
+        <w:t>N-2, W-3, L-0</w:t>
+      </w:r>
+    </w:p>
+    <w:p>
+      <w:pPr>
+        <w:pStyle w:val="ListParagraph"/>
+        <w:numPr>
+          <w:ilvl w:val="0"/>
+          <w:numId w:val="2"/>
+        </w:numPr>
+        <w:rPr>
+          <w:sz w:val="26"/>
+          <w:szCs w:val="24"/>
+          <w:lang w:val="en-US"/>
+        </w:rPr>
+      </w:pPr>
       <w:r>
         <w:rPr>
           <w:sz w:val="24"/>
@@ -3211,7 +4484,7 @@
         <w:ind w:left="1440" w:hanging="360"/>
       </w:pPr>
     </w:lvl>
-    <w:lvl w:ilvl="2" w:tplc="4009001B" w:tentative="1">
+    <w:lvl w:ilvl="2" w:tplc="4009001B">
       <w:start w:val="1"/>
       <w:numFmt w:val="lowerRoman"/>
       <w:lvlText w:val="%3."/>

</xml_diff>

<commit_message>
Date: 23 Mar 2026
</commit_message>
<xml_diff>
--- a/Assignments.docx
+++ b/Assignments.docx
@@ -3796,18 +3796,7 @@
           <w:highlight w:val="yellow"/>
           <w:lang w:val="en-US"/>
         </w:rPr>
-        <w:t xml:space="preserve">Click on </w:t>
-      </w:r>
-      <w:bookmarkStart w:id="0" w:name="_GoBack"/>
-      <w:bookmarkEnd w:id="0"/>
-      <w:r>
-        <w:rPr>
-          <w:sz w:val="24"/>
-          <w:szCs w:val="24"/>
-          <w:highlight w:val="yellow"/>
-          <w:lang w:val="en-US"/>
-        </w:rPr>
-        <w:t>My Info</w:t>
+        <w:t>Click on My Info</w:t>
       </w:r>
     </w:p>
     <w:p>
@@ -4349,6 +4338,63 @@
           <w:lang w:val="en-US"/>
         </w:rPr>
       </w:pPr>
+      <w:r>
+        <w:rPr>
+          <w:sz w:val="24"/>
+          <w:szCs w:val="22"/>
+          <w:lang w:val="en-US"/>
+        </w:rPr>
+        <w:t xml:space="preserve">Launch </w:t>
+      </w:r>
+      <w:hyperlink r:id="rId23" w:history="1">
+        <w:r>
+          <w:rPr>
+            <w:rStyle w:val="Hyperlink"/>
+            <w:sz w:val="24"/>
+            <w:szCs w:val="22"/>
+            <w:lang w:val="en-US"/>
+          </w:rPr>
+          <w:t>https://istqb.in/</w:t>
+        </w:r>
+      </w:hyperlink>
+    </w:p>
+    <w:p>
+      <w:pPr>
+        <w:pStyle w:val="ListParagraph"/>
+        <w:numPr>
+          <w:ilvl w:val="1"/>
+          <w:numId w:val="2"/>
+        </w:numPr>
+        <w:rPr>
+          <w:sz w:val="26"/>
+          <w:szCs w:val="24"/>
+          <w:lang w:val="en-US"/>
+        </w:rPr>
+      </w:pPr>
+      <w:r>
+        <w:rPr>
+          <w:sz w:val="24"/>
+          <w:szCs w:val="22"/>
+          <w:lang w:val="en-US"/>
+        </w:rPr>
+        <w:t>Display all 8 menus</w:t>
+      </w:r>
+    </w:p>
+    <w:p>
+      <w:pPr>
+        <w:pStyle w:val="ListParagraph"/>
+        <w:numPr>
+          <w:ilvl w:val="0"/>
+          <w:numId w:val="2"/>
+        </w:numPr>
+        <w:rPr>
+          <w:sz w:val="26"/>
+          <w:szCs w:val="24"/>
+          <w:lang w:val="en-US"/>
+        </w:rPr>
+      </w:pPr>
+      <w:bookmarkStart w:id="0" w:name="_GoBack"/>
+      <w:bookmarkEnd w:id="0"/>
       <w:r>
         <w:rPr>
           <w:sz w:val="24"/>

</xml_diff>

<commit_message>
Date: 27 Mar 2026
</commit_message>
<xml_diff>
--- a/Assignments.docx
+++ b/Assignments.docx
@@ -4393,16 +4393,573 @@
           <w:lang w:val="en-US"/>
         </w:rPr>
       </w:pPr>
+      <w:r>
+        <w:rPr>
+          <w:sz w:val="24"/>
+          <w:szCs w:val="22"/>
+          <w:lang w:val="en-US"/>
+        </w:rPr>
+        <w:br/>
+      </w:r>
+    </w:p>
+    <w:p>
+      <w:pPr>
+        <w:rPr>
+          <w:sz w:val="26"/>
+          <w:szCs w:val="24"/>
+          <w:lang w:val="en-US"/>
+        </w:rPr>
+      </w:pPr>
+      <w:r>
+        <w:rPr>
+          <w:sz w:val="26"/>
+          <w:szCs w:val="24"/>
+          <w:lang w:val="en-US"/>
+        </w:rPr>
+        <w:br w:type="page"/>
+      </w:r>
+    </w:p>
+    <w:p>
+      <w:pPr>
+        <w:rPr>
+          <w:b/>
+          <w:bCs/>
+          <w:sz w:val="26"/>
+          <w:szCs w:val="24"/>
+          <w:lang w:val="en-US"/>
+        </w:rPr>
+      </w:pPr>
+      <w:r>
+        <w:rPr>
+          <w:b/>
+          <w:bCs/>
+          <w:sz w:val="26"/>
+          <w:szCs w:val="24"/>
+          <w:lang w:val="en-US"/>
+        </w:rPr>
+        <w:lastRenderedPageBreak/>
+        <w:t>TestNG Assignments</w:t>
+      </w:r>
+    </w:p>
+    <w:p>
+      <w:pPr>
+        <w:pStyle w:val="ListParagraph"/>
+        <w:numPr>
+          <w:ilvl w:val="0"/>
+          <w:numId w:val="5"/>
+        </w:numPr>
+        <w:rPr>
+          <w:sz w:val="26"/>
+          <w:szCs w:val="24"/>
+          <w:lang w:val="en-US"/>
+        </w:rPr>
+      </w:pPr>
+      <w:r>
+        <w:rPr>
+          <w:sz w:val="26"/>
+          <w:szCs w:val="24"/>
+          <w:lang w:val="en-US"/>
+        </w:rPr>
+        <w:t>Selenium Assignment</w:t>
+      </w:r>
+    </w:p>
+    <w:p>
+      <w:pPr>
+        <w:pStyle w:val="ListParagraph"/>
+        <w:numPr>
+          <w:ilvl w:val="1"/>
+          <w:numId w:val="5"/>
+        </w:numPr>
+        <w:rPr>
+          <w:sz w:val="26"/>
+          <w:szCs w:val="24"/>
+          <w:lang w:val="en-US"/>
+        </w:rPr>
+      </w:pPr>
       <w:bookmarkStart w:id="0" w:name="_GoBack"/>
+      <w:r>
+        <w:rPr>
+          <w:sz w:val="26"/>
+          <w:szCs w:val="24"/>
+          <w:lang w:val="en-US"/>
+        </w:rPr>
+        <w:t xml:space="preserve">Launch </w:t>
+      </w:r>
+      <w:hyperlink r:id="rId24" w:history="1">
+        <w:r>
+          <w:rPr>
+            <w:rStyle w:val="Hyperlink"/>
+            <w:sz w:val="26"/>
+            <w:szCs w:val="24"/>
+            <w:lang w:val="en-US"/>
+          </w:rPr>
+          <w:t>https://www.selenium.dev/</w:t>
+        </w:r>
+      </w:hyperlink>
+    </w:p>
+    <w:p>
+      <w:pPr>
+        <w:pStyle w:val="ListParagraph"/>
+        <w:numPr>
+          <w:ilvl w:val="1"/>
+          <w:numId w:val="5"/>
+        </w:numPr>
+        <w:rPr>
+          <w:sz w:val="26"/>
+          <w:szCs w:val="24"/>
+          <w:lang w:val="en-US"/>
+        </w:rPr>
+      </w:pPr>
+      <w:r>
+        <w:rPr>
+          <w:sz w:val="26"/>
+          <w:szCs w:val="24"/>
+          <w:lang w:val="en-US"/>
+        </w:rPr>
+        <w:t>Print the title</w:t>
+      </w:r>
+    </w:p>
+    <w:p>
+      <w:pPr>
+        <w:pStyle w:val="ListParagraph"/>
+        <w:numPr>
+          <w:ilvl w:val="1"/>
+          <w:numId w:val="5"/>
+        </w:numPr>
+        <w:rPr>
+          <w:b/>
+          <w:bCs/>
+          <w:sz w:val="26"/>
+          <w:szCs w:val="24"/>
+          <w:lang w:val="en-US"/>
+        </w:rPr>
+      </w:pPr>
+      <w:r>
+        <w:rPr>
+          <w:b/>
+          <w:bCs/>
+          <w:sz w:val="26"/>
+          <w:szCs w:val="24"/>
+          <w:lang w:val="en-US"/>
+        </w:rPr>
+        <w:t>Click on Downloads link</w:t>
+      </w:r>
+    </w:p>
+    <w:p>
+      <w:pPr>
+        <w:pStyle w:val="ListParagraph"/>
+        <w:numPr>
+          <w:ilvl w:val="1"/>
+          <w:numId w:val="5"/>
+        </w:numPr>
+        <w:rPr>
+          <w:sz w:val="26"/>
+          <w:szCs w:val="24"/>
+          <w:lang w:val="en-US"/>
+        </w:rPr>
+      </w:pPr>
+      <w:r>
+        <w:rPr>
+          <w:sz w:val="26"/>
+          <w:szCs w:val="24"/>
+          <w:lang w:val="en-US"/>
+        </w:rPr>
+        <w:t>Print the title</w:t>
+      </w:r>
+      <w:r>
+        <w:rPr>
+          <w:sz w:val="26"/>
+          <w:szCs w:val="24"/>
+          <w:lang w:val="en-US"/>
+        </w:rPr>
+        <w:br/>
+      </w:r>
+    </w:p>
+    <w:p>
+      <w:pPr>
+        <w:pStyle w:val="ListParagraph"/>
+        <w:numPr>
+          <w:ilvl w:val="1"/>
+          <w:numId w:val="5"/>
+        </w:numPr>
+        <w:rPr>
+          <w:sz w:val="26"/>
+          <w:szCs w:val="24"/>
+          <w:lang w:val="en-US"/>
+        </w:rPr>
+      </w:pPr>
+      <w:r>
+        <w:rPr>
+          <w:sz w:val="26"/>
+          <w:szCs w:val="24"/>
+          <w:lang w:val="en-US"/>
+        </w:rPr>
+        <w:t xml:space="preserve">Launch </w:t>
+      </w:r>
+      <w:hyperlink r:id="rId25" w:history="1">
+        <w:r>
+          <w:rPr>
+            <w:rStyle w:val="Hyperlink"/>
+            <w:sz w:val="26"/>
+            <w:szCs w:val="24"/>
+            <w:lang w:val="en-US"/>
+          </w:rPr>
+          <w:t>https://www.selenium.dev/</w:t>
+        </w:r>
+      </w:hyperlink>
+    </w:p>
+    <w:p>
+      <w:pPr>
+        <w:pStyle w:val="ListParagraph"/>
+        <w:numPr>
+          <w:ilvl w:val="1"/>
+          <w:numId w:val="5"/>
+        </w:numPr>
+        <w:rPr>
+          <w:sz w:val="26"/>
+          <w:szCs w:val="24"/>
+          <w:lang w:val="en-US"/>
+        </w:rPr>
+      </w:pPr>
+      <w:r>
+        <w:rPr>
+          <w:sz w:val="26"/>
+          <w:szCs w:val="24"/>
+          <w:lang w:val="en-US"/>
+        </w:rPr>
+        <w:t>Print the title</w:t>
+      </w:r>
+    </w:p>
+    <w:p>
+      <w:pPr>
+        <w:pStyle w:val="ListParagraph"/>
+        <w:numPr>
+          <w:ilvl w:val="1"/>
+          <w:numId w:val="5"/>
+        </w:numPr>
+        <w:rPr>
+          <w:b/>
+          <w:bCs/>
+          <w:sz w:val="26"/>
+          <w:szCs w:val="24"/>
+          <w:lang w:val="en-US"/>
+        </w:rPr>
+      </w:pPr>
+      <w:r>
+        <w:rPr>
+          <w:b/>
+          <w:bCs/>
+          <w:sz w:val="26"/>
+          <w:szCs w:val="24"/>
+          <w:lang w:val="en-US"/>
+        </w:rPr>
+        <w:t xml:space="preserve">Click on </w:t>
+      </w:r>
+      <w:r>
+        <w:rPr>
+          <w:b/>
+          <w:bCs/>
+          <w:sz w:val="26"/>
+          <w:szCs w:val="24"/>
+          <w:lang w:val="en-US"/>
+        </w:rPr>
+        <w:t>Documentation</w:t>
+      </w:r>
+      <w:r>
+        <w:rPr>
+          <w:b/>
+          <w:bCs/>
+          <w:sz w:val="26"/>
+          <w:szCs w:val="24"/>
+          <w:lang w:val="en-US"/>
+        </w:rPr>
+        <w:t xml:space="preserve"> link</w:t>
+      </w:r>
+    </w:p>
+    <w:p>
+      <w:pPr>
+        <w:pStyle w:val="ListParagraph"/>
+        <w:numPr>
+          <w:ilvl w:val="1"/>
+          <w:numId w:val="5"/>
+        </w:numPr>
+        <w:rPr>
+          <w:sz w:val="26"/>
+          <w:szCs w:val="24"/>
+          <w:lang w:val="en-US"/>
+        </w:rPr>
+      </w:pPr>
+      <w:r>
+        <w:rPr>
+          <w:sz w:val="26"/>
+          <w:szCs w:val="24"/>
+          <w:lang w:val="en-US"/>
+        </w:rPr>
+        <w:t>Print the title</w:t>
+      </w:r>
+      <w:r>
+        <w:rPr>
+          <w:sz w:val="26"/>
+          <w:szCs w:val="24"/>
+          <w:lang w:val="en-US"/>
+        </w:rPr>
+        <w:br/>
+      </w:r>
+    </w:p>
+    <w:p>
+      <w:pPr>
+        <w:pStyle w:val="ListParagraph"/>
+        <w:numPr>
+          <w:ilvl w:val="1"/>
+          <w:numId w:val="5"/>
+        </w:numPr>
+        <w:rPr>
+          <w:sz w:val="26"/>
+          <w:szCs w:val="24"/>
+          <w:lang w:val="en-US"/>
+        </w:rPr>
+      </w:pPr>
+      <w:r>
+        <w:rPr>
+          <w:sz w:val="26"/>
+          <w:szCs w:val="24"/>
+          <w:lang w:val="en-US"/>
+        </w:rPr>
+        <w:t xml:space="preserve">Launch </w:t>
+      </w:r>
+      <w:hyperlink r:id="rId26" w:history="1">
+        <w:r>
+          <w:rPr>
+            <w:rStyle w:val="Hyperlink"/>
+            <w:sz w:val="26"/>
+            <w:szCs w:val="24"/>
+            <w:lang w:val="en-US"/>
+          </w:rPr>
+          <w:t>https://www.selenium.dev/</w:t>
+        </w:r>
+      </w:hyperlink>
+    </w:p>
+    <w:p>
+      <w:pPr>
+        <w:pStyle w:val="ListParagraph"/>
+        <w:numPr>
+          <w:ilvl w:val="1"/>
+          <w:numId w:val="5"/>
+        </w:numPr>
+        <w:rPr>
+          <w:sz w:val="26"/>
+          <w:szCs w:val="24"/>
+          <w:lang w:val="en-US"/>
+        </w:rPr>
+      </w:pPr>
+      <w:r>
+        <w:rPr>
+          <w:sz w:val="26"/>
+          <w:szCs w:val="24"/>
+          <w:lang w:val="en-US"/>
+        </w:rPr>
+        <w:t>Print the title</w:t>
+      </w:r>
+    </w:p>
+    <w:p>
+      <w:pPr>
+        <w:pStyle w:val="ListParagraph"/>
+        <w:numPr>
+          <w:ilvl w:val="1"/>
+          <w:numId w:val="5"/>
+        </w:numPr>
+        <w:rPr>
+          <w:b/>
+          <w:bCs/>
+          <w:sz w:val="26"/>
+          <w:szCs w:val="24"/>
+          <w:lang w:val="en-US"/>
+        </w:rPr>
+      </w:pPr>
+      <w:r>
+        <w:rPr>
+          <w:b/>
+          <w:bCs/>
+          <w:sz w:val="26"/>
+          <w:szCs w:val="24"/>
+          <w:lang w:val="en-US"/>
+        </w:rPr>
+        <w:t xml:space="preserve">Click on </w:t>
+      </w:r>
+      <w:r>
+        <w:rPr>
+          <w:b/>
+          <w:bCs/>
+          <w:sz w:val="26"/>
+          <w:szCs w:val="24"/>
+          <w:lang w:val="en-US"/>
+        </w:rPr>
+        <w:t>Project</w:t>
+      </w:r>
+      <w:r>
+        <w:rPr>
+          <w:b/>
+          <w:bCs/>
+          <w:sz w:val="26"/>
+          <w:szCs w:val="24"/>
+          <w:lang w:val="en-US"/>
+        </w:rPr>
+        <w:t xml:space="preserve"> link</w:t>
+      </w:r>
+    </w:p>
+    <w:p>
+      <w:pPr>
+        <w:pStyle w:val="ListParagraph"/>
+        <w:numPr>
+          <w:ilvl w:val="1"/>
+          <w:numId w:val="5"/>
+        </w:numPr>
+        <w:rPr>
+          <w:sz w:val="26"/>
+          <w:szCs w:val="24"/>
+          <w:lang w:val="en-US"/>
+        </w:rPr>
+      </w:pPr>
+      <w:r>
+        <w:rPr>
+          <w:sz w:val="26"/>
+          <w:szCs w:val="24"/>
+          <w:lang w:val="en-US"/>
+        </w:rPr>
+        <w:t>Print the title</w:t>
+      </w:r>
+      <w:r>
+        <w:rPr>
+          <w:sz w:val="26"/>
+          <w:szCs w:val="24"/>
+          <w:lang w:val="en-US"/>
+        </w:rPr>
+        <w:br/>
+      </w:r>
+    </w:p>
+    <w:p>
+      <w:pPr>
+        <w:pStyle w:val="ListParagraph"/>
+        <w:numPr>
+          <w:ilvl w:val="1"/>
+          <w:numId w:val="5"/>
+        </w:numPr>
+        <w:rPr>
+          <w:sz w:val="26"/>
+          <w:szCs w:val="24"/>
+          <w:lang w:val="en-US"/>
+        </w:rPr>
+      </w:pPr>
+      <w:r>
+        <w:rPr>
+          <w:sz w:val="26"/>
+          <w:szCs w:val="24"/>
+          <w:lang w:val="en-US"/>
+        </w:rPr>
+        <w:t xml:space="preserve">Launch </w:t>
+      </w:r>
+      <w:hyperlink r:id="rId27" w:history="1">
+        <w:r>
+          <w:rPr>
+            <w:rStyle w:val="Hyperlink"/>
+            <w:sz w:val="26"/>
+            <w:szCs w:val="24"/>
+            <w:lang w:val="en-US"/>
+          </w:rPr>
+          <w:t>https://www.selenium.dev/</w:t>
+        </w:r>
+      </w:hyperlink>
+    </w:p>
+    <w:p>
+      <w:pPr>
+        <w:pStyle w:val="ListParagraph"/>
+        <w:numPr>
+          <w:ilvl w:val="1"/>
+          <w:numId w:val="5"/>
+        </w:numPr>
+        <w:rPr>
+          <w:sz w:val="26"/>
+          <w:szCs w:val="24"/>
+          <w:lang w:val="en-US"/>
+        </w:rPr>
+      </w:pPr>
+      <w:r>
+        <w:rPr>
+          <w:sz w:val="26"/>
+          <w:szCs w:val="24"/>
+          <w:lang w:val="en-US"/>
+        </w:rPr>
+        <w:t>Print the title</w:t>
+      </w:r>
+    </w:p>
+    <w:p>
+      <w:pPr>
+        <w:pStyle w:val="ListParagraph"/>
+        <w:numPr>
+          <w:ilvl w:val="1"/>
+          <w:numId w:val="5"/>
+        </w:numPr>
+        <w:rPr>
+          <w:b/>
+          <w:bCs/>
+          <w:sz w:val="26"/>
+          <w:szCs w:val="24"/>
+          <w:lang w:val="en-US"/>
+        </w:rPr>
+      </w:pPr>
+      <w:r>
+        <w:rPr>
+          <w:b/>
+          <w:bCs/>
+          <w:sz w:val="26"/>
+          <w:szCs w:val="24"/>
+          <w:lang w:val="en-US"/>
+        </w:rPr>
+        <w:t xml:space="preserve">Click on </w:t>
+      </w:r>
+      <w:r>
+        <w:rPr>
+          <w:b/>
+          <w:bCs/>
+          <w:sz w:val="26"/>
+          <w:szCs w:val="24"/>
+          <w:lang w:val="en-US"/>
+        </w:rPr>
+        <w:t>Support</w:t>
+      </w:r>
+      <w:r>
+        <w:rPr>
+          <w:b/>
+          <w:bCs/>
+          <w:sz w:val="26"/>
+          <w:szCs w:val="24"/>
+          <w:lang w:val="en-US"/>
+        </w:rPr>
+        <w:t xml:space="preserve"> link</w:t>
+      </w:r>
+    </w:p>
+    <w:p>
+      <w:pPr>
+        <w:pStyle w:val="ListParagraph"/>
+        <w:numPr>
+          <w:ilvl w:val="1"/>
+          <w:numId w:val="5"/>
+        </w:numPr>
+        <w:rPr>
+          <w:sz w:val="26"/>
+          <w:szCs w:val="24"/>
+          <w:lang w:val="en-US"/>
+        </w:rPr>
+      </w:pPr>
+      <w:r>
+        <w:rPr>
+          <w:sz w:val="26"/>
+          <w:szCs w:val="24"/>
+          <w:lang w:val="en-US"/>
+        </w:rPr>
+        <w:t>Print the title</w:t>
+      </w:r>
       <w:bookmarkEnd w:id="0"/>
-      <w:r>
-        <w:rPr>
-          <w:sz w:val="24"/>
-          <w:szCs w:val="22"/>
-          <w:lang w:val="en-US"/>
-        </w:rPr>
-        <w:br/>
-      </w:r>
     </w:p>
     <w:sectPr>
       <w:pgSz w:w="11906" w:h="16838"/>
@@ -4506,9 +5063,9 @@
     </w:lvl>
   </w:abstractNum>
   <w:abstractNum w:abstractNumId="1">
-    <w:nsid w:val="4D35219C"/>
+    <w:nsid w:val="4B084025"/>
     <w:multiLevelType w:val="hybridMultilevel"/>
-    <w:tmpl w:val="C2828002"/>
+    <w:tmpl w:val="FC726532"/>
     <w:lvl w:ilvl="0" w:tplc="4009000F">
       <w:start w:val="1"/>
       <w:numFmt w:val="decimal"/>
@@ -4530,7 +5087,7 @@
         <w:ind w:left="1440" w:hanging="360"/>
       </w:pPr>
     </w:lvl>
-    <w:lvl w:ilvl="2" w:tplc="4009001B">
+    <w:lvl w:ilvl="2" w:tplc="4009001B" w:tentative="1">
       <w:start w:val="1"/>
       <w:numFmt w:val="lowerRoman"/>
       <w:lvlText w:val="%3."/>
@@ -4595,6 +5152,95 @@
     </w:lvl>
   </w:abstractNum>
   <w:abstractNum w:abstractNumId="2">
+    <w:nsid w:val="4D35219C"/>
+    <w:multiLevelType w:val="hybridMultilevel"/>
+    <w:tmpl w:val="C2828002"/>
+    <w:lvl w:ilvl="0" w:tplc="4009000F">
+      <w:start w:val="1"/>
+      <w:numFmt w:val="decimal"/>
+      <w:lvlText w:val="%1."/>
+      <w:lvlJc w:val="left"/>
+      <w:pPr>
+        <w:ind w:left="720" w:hanging="360"/>
+      </w:pPr>
+      <w:rPr>
+        <w:rFonts w:hint="default"/>
+      </w:rPr>
+    </w:lvl>
+    <w:lvl w:ilvl="1" w:tplc="40090019">
+      <w:start w:val="1"/>
+      <w:numFmt w:val="lowerLetter"/>
+      <w:lvlText w:val="%2."/>
+      <w:lvlJc w:val="left"/>
+      <w:pPr>
+        <w:ind w:left="1440" w:hanging="360"/>
+      </w:pPr>
+    </w:lvl>
+    <w:lvl w:ilvl="2" w:tplc="4009001B">
+      <w:start w:val="1"/>
+      <w:numFmt w:val="lowerRoman"/>
+      <w:lvlText w:val="%3."/>
+      <w:lvlJc w:val="right"/>
+      <w:pPr>
+        <w:ind w:left="2160" w:hanging="180"/>
+      </w:pPr>
+    </w:lvl>
+    <w:lvl w:ilvl="3" w:tplc="4009000F" w:tentative="1">
+      <w:start w:val="1"/>
+      <w:numFmt w:val="decimal"/>
+      <w:lvlText w:val="%4."/>
+      <w:lvlJc w:val="left"/>
+      <w:pPr>
+        <w:ind w:left="2880" w:hanging="360"/>
+      </w:pPr>
+    </w:lvl>
+    <w:lvl w:ilvl="4" w:tplc="40090019" w:tentative="1">
+      <w:start w:val="1"/>
+      <w:numFmt w:val="lowerLetter"/>
+      <w:lvlText w:val="%5."/>
+      <w:lvlJc w:val="left"/>
+      <w:pPr>
+        <w:ind w:left="3600" w:hanging="360"/>
+      </w:pPr>
+    </w:lvl>
+    <w:lvl w:ilvl="5" w:tplc="4009001B" w:tentative="1">
+      <w:start w:val="1"/>
+      <w:numFmt w:val="lowerRoman"/>
+      <w:lvlText w:val="%6."/>
+      <w:lvlJc w:val="right"/>
+      <w:pPr>
+        <w:ind w:left="4320" w:hanging="180"/>
+      </w:pPr>
+    </w:lvl>
+    <w:lvl w:ilvl="6" w:tplc="4009000F" w:tentative="1">
+      <w:start w:val="1"/>
+      <w:numFmt w:val="decimal"/>
+      <w:lvlText w:val="%7."/>
+      <w:lvlJc w:val="left"/>
+      <w:pPr>
+        <w:ind w:left="5040" w:hanging="360"/>
+      </w:pPr>
+    </w:lvl>
+    <w:lvl w:ilvl="7" w:tplc="40090019" w:tentative="1">
+      <w:start w:val="1"/>
+      <w:numFmt w:val="lowerLetter"/>
+      <w:lvlText w:val="%8."/>
+      <w:lvlJc w:val="left"/>
+      <w:pPr>
+        <w:ind w:left="5760" w:hanging="360"/>
+      </w:pPr>
+    </w:lvl>
+    <w:lvl w:ilvl="8" w:tplc="4009001B" w:tentative="1">
+      <w:start w:val="1"/>
+      <w:numFmt w:val="lowerRoman"/>
+      <w:lvlText w:val="%9."/>
+      <w:lvlJc w:val="right"/>
+      <w:pPr>
+        <w:ind w:left="6480" w:hanging="180"/>
+      </w:pPr>
+    </w:lvl>
+  </w:abstractNum>
+  <w:abstractNum w:abstractNumId="3">
     <w:nsid w:val="79C1442D"/>
     <w:multiLevelType w:val="hybridMultilevel"/>
     <w:tmpl w:val="5E50A9F0"/>
@@ -4684,10 +5330,10 @@
     <w:abstractNumId w:val="0"/>
   </w:num>
   <w:num w:numId="2">
-    <w:abstractNumId w:val="1"/>
+    <w:abstractNumId w:val="2"/>
   </w:num>
   <w:num w:numId="3">
-    <w:abstractNumId w:val="2"/>
+    <w:abstractNumId w:val="3"/>
     <w:lvlOverride w:ilvl="0">
       <w:startOverride w:val="1"/>
     </w:lvlOverride>
@@ -4717,7 +5363,10 @@
     </w:lvlOverride>
   </w:num>
   <w:num w:numId="4">
-    <w:abstractNumId w:val="2"/>
+    <w:abstractNumId w:val="3"/>
+  </w:num>
+  <w:num w:numId="5">
+    <w:abstractNumId w:val="1"/>
   </w:num>
 </w:numbering>
 </file>

</xml_diff>